<commit_message>
Added .gitignore to ny notes
</commit_message>
<xml_diff>
--- a/Persönliche Hilsmittel/Java.docx
+++ b/Persönliche Hilsmittel/Java.docx
@@ -1,6 +1,6 @@
 
 <file path=word/document.xml><?xml version="1.0" encoding="utf-8"?>
-<w:document xmlns:wpc="http://schemas.microsoft.com/office/word/2010/wordprocessingCanvas" xmlns:cx="http://schemas.microsoft.com/office/drawing/2014/chartex" xmlns:cx1="http://schemas.microsoft.com/office/drawing/2015/9/8/chartex" xmlns:cx2="http://schemas.microsoft.com/office/drawing/2015/10/21/chartex" xmlns:cx3="http://schemas.microsoft.com/office/drawing/2016/5/9/chartex" xmlns:cx4="http://schemas.microsoft.com/office/drawing/2016/5/10/chartex" xmlns:cx5="http://schemas.microsoft.com/office/drawing/2016/5/11/chartex" xmlns:cx6="http://schemas.microsoft.com/office/drawing/2016/5/12/chartex" xmlns:cx7="http://schemas.microsoft.com/office/drawing/2016/5/13/chartex" xmlns:cx8="http://schemas.microsoft.com/office/drawing/2016/5/14/chartex" xmlns:mc="http://schemas.openxmlformats.org/markup-compatibility/2006" xmlns:aink="http://schemas.microsoft.com/office/drawing/2016/ink" xmlns:am3d="http://schemas.microsoft.com/office/drawing/2017/model3d" xmlns:o="urn:schemas-microsoft-com:office:office" xmlns:oel="http://schemas.microsoft.com/office/2019/extlst" xmlns:r="http://schemas.openxmlformats.org/officeDocument/2006/relationships" xmlns:m="http://schemas.openxmlformats.org/officeDocument/2006/math" xmlns:v="urn:schemas-microsoft-com:vml" xmlns:wp14="http://schemas.microsoft.com/office/word/2010/wordprocessingDrawing" xmlns:wp="http://schemas.openxmlformats.org/drawingml/2006/wordprocessingDrawing" xmlns:w10="urn:schemas-microsoft-com:office:word" xmlns:w="http://schemas.openxmlformats.org/wordprocessingml/2006/main" xmlns:w14="http://schemas.microsoft.com/office/word/2010/wordml" xmlns:w15="http://schemas.microsoft.com/office/word/2012/wordml" xmlns:w16cei="http://schemas.microsoft.com/office/word/2026/wordml/cei" xmlns:w16cex="http://schemas.microsoft.com/office/word/2018/wordml/cex" xmlns:w16cid="http://schemas.microsoft.com/office/word/2016/wordml/cid" xmlns:w16="http://schemas.microsoft.com/office/word/2018/wordml" xmlns:w16du="http://schemas.microsoft.com/office/word/2023/wordml/word16du" xmlns:w16sdtdh="http://schemas.microsoft.com/office/word/2020/wordml/sdtdatahash" xmlns:w16sdtfl="http://schemas.microsoft.com/office/word/2024/wordml/sdtformatlock" xmlns:w16se="http://schemas.microsoft.com/office/word/2015/wordml/symex" xmlns:wpg="http://schemas.microsoft.com/office/word/2010/wordprocessingGroup" xmlns:wpi="http://schemas.microsoft.com/office/word/2010/wordprocessingInk" xmlns:wne="http://schemas.microsoft.com/office/word/2006/wordml" xmlns:wps="http://schemas.microsoft.com/office/word/2010/wordprocessingShape" mc:Ignorable="w14 w15 w16se w16cid w16 w16cex w16sdtdh w16sdtfl w16du wp14">
+<w:document xmlns:wpc="http://schemas.microsoft.com/office/word/2010/wordprocessingCanvas" xmlns:cx="http://schemas.microsoft.com/office/drawing/2014/chartex" xmlns:cx1="http://schemas.microsoft.com/office/drawing/2015/9/8/chartex" xmlns:cx2="http://schemas.microsoft.com/office/drawing/2015/10/21/chartex" xmlns:cx3="http://schemas.microsoft.com/office/drawing/2016/5/9/chartex" xmlns:cx4="http://schemas.microsoft.com/office/drawing/2016/5/10/chartex" xmlns:cx5="http://schemas.microsoft.com/office/drawing/2016/5/11/chartex" xmlns:cx6="http://schemas.microsoft.com/office/drawing/2016/5/12/chartex" xmlns:cx7="http://schemas.microsoft.com/office/drawing/2016/5/13/chartex" xmlns:cx8="http://schemas.microsoft.com/office/drawing/2016/5/14/chartex" xmlns:mc="http://schemas.openxmlformats.org/markup-compatibility/2006" xmlns:aink="http://schemas.microsoft.com/office/drawing/2016/ink" xmlns:am3d="http://schemas.microsoft.com/office/drawing/2017/model3d" xmlns:o="urn:schemas-microsoft-com:office:office" xmlns:oel="http://schemas.microsoft.com/office/2019/extlst" xmlns:r="http://schemas.openxmlformats.org/officeDocument/2006/relationships" xmlns:m="http://schemas.openxmlformats.org/officeDocument/2006/math" xmlns:v="urn:schemas-microsoft-com:vml" xmlns:wp14="http://schemas.microsoft.com/office/word/2010/wordprocessingDrawing" xmlns:wp="http://schemas.openxmlformats.org/drawingml/2006/wordprocessingDrawing" xmlns:w10="urn:schemas-microsoft-com:office:word" xmlns:w="http://schemas.openxmlformats.org/wordprocessingml/2006/main" xmlns:w14="http://schemas.microsoft.com/office/word/2010/wordml" xmlns:w15="http://schemas.microsoft.com/office/word/2012/wordml" xmlns:w16cex="http://schemas.microsoft.com/office/word/2018/wordml/cex" xmlns:w16cid="http://schemas.microsoft.com/office/word/2016/wordml/cid" xmlns:w16="http://schemas.microsoft.com/office/word/2018/wordml" xmlns:w16du="http://schemas.microsoft.com/office/word/2023/wordml/word16du" xmlns:w16sdtdh="http://schemas.microsoft.com/office/word/2020/wordml/sdtdatahash" xmlns:w16sdtfl="http://schemas.microsoft.com/office/word/2024/wordml/sdtformatlock" xmlns:w16se="http://schemas.microsoft.com/office/word/2015/wordml/symex" xmlns:wpg="http://schemas.microsoft.com/office/word/2010/wordprocessingGroup" xmlns:wpi="http://schemas.microsoft.com/office/word/2010/wordprocessingInk" xmlns:wne="http://schemas.microsoft.com/office/word/2006/wordml" xmlns:wps="http://schemas.microsoft.com/office/word/2010/wordprocessingShape" mc:Ignorable="w14 w15 w16se w16cid w16 w16cex w16sdtdh w16sdtfl w16du wp14">
   <w:body>
     <w:p>
       <w:pPr>
@@ -685,7 +685,7 @@
               </wp:anchor>
             </w:drawing>
           </mc:Choice>
-          <mc:Fallback>
+          <mc:Fallback xmlns:w16cei="http://schemas.microsoft.com/office/word/2026/wordml/cei">
             <w:pict>
               <v:shapetype w14:anchorId="67DC78B4" id="_x0000_t75" coordsize="21600,21600" o:spt="75" o:preferrelative="t" path="m@4@5l@4@11@9@11@9@5xe" filled="f" stroked="f">
                 <v:stroke joinstyle="miter"/>
@@ -800,7 +800,7 @@
               </wp:anchor>
             </w:drawing>
           </mc:Choice>
-          <mc:Fallback>
+          <mc:Fallback xmlns:w16cei="http://schemas.microsoft.com/office/word/2026/wordml/cei">
             <w:pict>
               <v:shape w14:anchorId="0248EAB6" id="Freihand 7" o:spid="_x0000_s1026" type="#_x0000_t75" style="position:absolute;margin-left:-173.55pt;margin-top:-20.2pt;width:35.85pt;height:106.1pt;z-index:251665408;visibility:visible;mso-wrap-style:square;mso-wrap-distance-left:9pt;mso-wrap-distance-top:0;mso-wrap-distance-right:9pt;mso-wrap-distance-bottom:0;mso-position-horizontal:absolute;mso-position-horizontal-relative:text;mso-position-vertical:absolute;mso-position-vertical-relative:text" o:gfxdata="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">
                 <v:imagedata r:id="rId8" o:title=""/>
@@ -854,7 +854,7 @@
               </wp:anchor>
             </w:drawing>
           </mc:Choice>
-          <mc:Fallback>
+          <mc:Fallback xmlns:w16cei="http://schemas.microsoft.com/office/word/2026/wordml/cei">
             <w:pict>
               <v:shape w14:anchorId="485E2D03" id="Freihand 9" o:spid="_x0000_s1026" type="#_x0000_t75" style="position:absolute;margin-left:-205.4pt;margin-top:-87.15pt;width:85.7pt;height:231.55pt;z-index:251667456;visibility:visible;mso-wrap-style:square;mso-wrap-distance-left:9pt;mso-wrap-distance-top:0;mso-wrap-distance-right:9pt;mso-wrap-distance-bottom:0;mso-position-horizontal:absolute;mso-position-horizontal-relative:text;mso-position-vertical:absolute;mso-position-vertical-relative:text" o:gfxdata="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">
                 <v:imagedata r:id="rId10" o:title=""/>
@@ -899,7 +899,7 @@
               </wp:anchor>
             </w:drawing>
           </mc:Choice>
-          <mc:Fallback>
+          <mc:Fallback xmlns:w16cei="http://schemas.microsoft.com/office/word/2026/wordml/cei">
             <w:pict>
               <v:shape w14:anchorId="4CA099C9" id="Freihand 6" o:spid="_x0000_s1026" type="#_x0000_t75" style="position:absolute;margin-left:-189.25pt;margin-top:-51.8pt;width:66.75pt;height:151.15pt;z-index:251664384;visibility:visible;mso-wrap-style:square;mso-wrap-distance-left:9pt;mso-wrap-distance-top:0;mso-wrap-distance-right:9pt;mso-wrap-distance-bottom:0;mso-position-horizontal:absolute;mso-position-horizontal-relative:text;mso-position-vertical:absolute;mso-position-vertical-relative:text" o:gfxdata="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">
                 <v:imagedata r:id="rId12" o:title=""/>
@@ -944,7 +944,7 @@
               </wp:anchor>
             </w:drawing>
           </mc:Choice>
-          <mc:Fallback>
+          <mc:Fallback xmlns:w16cei="http://schemas.microsoft.com/office/word/2026/wordml/cei">
             <w:pict>
               <v:shape w14:anchorId="3AE2165F" id="Freihand 3" o:spid="_x0000_s1026" type="#_x0000_t75" style="position:absolute;margin-left:-188.65pt;margin-top:-54.6pt;width:58.05pt;height:168.5pt;z-index:251661312;visibility:visible;mso-wrap-style:square;mso-wrap-distance-left:9pt;mso-wrap-distance-top:0;mso-wrap-distance-right:9pt;mso-wrap-distance-bottom:0;mso-position-horizontal:absolute;mso-position-horizontal-relative:text;mso-position-vertical:absolute;mso-position-vertical-relative:text" o:gfxdata="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">
                 <v:imagedata r:id="rId14" o:title=""/>
@@ -1023,7 +1023,7 @@
               </wp:anchor>
             </w:drawing>
           </mc:Choice>
-          <mc:Fallback>
+          <mc:Fallback xmlns:w16cei="http://schemas.microsoft.com/office/word/2026/wordml/cei">
             <w:pict>
               <v:shape w14:anchorId="23AE3421" id="Freihand 8" o:spid="_x0000_s1026" type="#_x0000_t75" style="position:absolute;margin-left:-187.65pt;margin-top:-65.3pt;width:66.15pt;height:150.45pt;z-index:251666432;visibility:visible;mso-wrap-style:square;mso-wrap-distance-left:9pt;mso-wrap-distance-top:0;mso-wrap-distance-right:9pt;mso-wrap-distance-bottom:0;mso-position-horizontal:absolute;mso-position-horizontal-relative:text;mso-position-vertical:absolute;mso-position-vertical-relative:text" o:gfxdata="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">
                 <v:imagedata r:id="rId16" o:title=""/>
@@ -1068,7 +1068,7 @@
               </wp:anchor>
             </w:drawing>
           </mc:Choice>
-          <mc:Fallback>
+          <mc:Fallback xmlns:w16cei="http://schemas.microsoft.com/office/word/2026/wordml/cei">
             <w:pict>
               <v:shape w14:anchorId="5D37BB29" id="Freihand 4" o:spid="_x0000_s1026" type="#_x0000_t75" style="position:absolute;margin-left:-178.75pt;margin-top:-38.7pt;width:49.95pt;height:94.55pt;z-index:251662336;visibility:visible;mso-wrap-style:square;mso-wrap-distance-left:9pt;mso-wrap-distance-top:0;mso-wrap-distance-right:9pt;mso-wrap-distance-bottom:0;mso-position-horizontal:absolute;mso-position-horizontal-relative:text;mso-position-vertical:absolute;mso-position-vertical-relative:text" o:gfxdata="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">
                 <v:imagedata r:id="rId18" o:title=""/>
@@ -1113,7 +1113,7 @@
               </wp:anchor>
             </w:drawing>
           </mc:Choice>
-          <mc:Fallback>
+          <mc:Fallback xmlns:w16cei="http://schemas.microsoft.com/office/word/2026/wordml/cei">
             <w:pict>
               <v:shape w14:anchorId="400A7B98" id="Freihand 2" o:spid="_x0000_s1026" type="#_x0000_t75" style="position:absolute;margin-left:-220.9pt;margin-top:-49.55pt;width:78.2pt;height:168.25pt;z-index:251660288;visibility:visible;mso-wrap-style:square;mso-wrap-distance-left:9pt;mso-wrap-distance-top:0;mso-wrap-distance-right:9pt;mso-wrap-distance-bottom:0;mso-position-horizontal:absolute;mso-position-horizontal-relative:text;mso-position-vertical:absolute;mso-position-vertical-relative:text" o:gfxdata="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">
                 <v:imagedata r:id="rId20" o:title=""/>
@@ -1158,7 +1158,7 @@
               </wp:anchor>
             </w:drawing>
           </mc:Choice>
-          <mc:Fallback>
+          <mc:Fallback xmlns:w16cei="http://schemas.microsoft.com/office/word/2026/wordml/cei">
             <w:pict>
               <v:shape w14:anchorId="4FDC9897" id="Freihand 1" o:spid="_x0000_s1026" type="#_x0000_t75" style="position:absolute;margin-left:-197.95pt;margin-top:-30.4pt;width:68.8pt;height:119.2pt;z-index:251659264;visibility:visible;mso-wrap-style:square;mso-wrap-distance-left:9pt;mso-wrap-distance-top:0;mso-wrap-distance-right:9pt;mso-wrap-distance-bottom:0;mso-position-horizontal:absolute;mso-position-horizontal-relative:text;mso-position-vertical:absolute;mso-position-vertical-relative:text" o:gfxdata="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">
                 <v:imagedata r:id="rId22" o:title=""/>
@@ -1385,108 +1385,589 @@
       </w:r>
     </w:p>
     <w:p>
-      <w:pPr>
-        <w:rPr>
-          <w:lang w:val="en-GB"/>
-        </w:rPr>
-      </w:pPr>
-      <w:r>
-        <w:rPr>
-          <w:lang w:val="en-GB"/>
-        </w:rPr>
+      <w:r>
         <w:t xml:space="preserve">String </w:t>
       </w:r>
       <w:proofErr w:type="spellStart"/>
       <w:r>
-        <w:rPr>
-          <w:lang w:val="en-GB"/>
-        </w:rPr>
         <w:t>wordleWord</w:t>
       </w:r>
       <w:proofErr w:type="spellEnd"/>
       <w:r>
-        <w:rPr>
-          <w:lang w:val="en-GB"/>
-        </w:rPr>
         <w:t xml:space="preserve"> = "TAKER";</w:t>
       </w:r>
     </w:p>
     <w:p>
-      <w:pPr>
-        <w:rPr>
-          <w:lang w:val="en-GB"/>
-        </w:rPr>
-      </w:pPr>
-      <w:r>
-        <w:rPr>
-          <w:lang w:val="en-GB"/>
-        </w:rPr>
-        <w:t>String artist = "Sabrina Carpenter";</w:t>
+      <w:r>
+        <w:t xml:space="preserve">String </w:t>
+      </w:r>
+      <w:proofErr w:type="spellStart"/>
+      <w:r>
+        <w:t>artist</w:t>
+      </w:r>
+      <w:proofErr w:type="spellEnd"/>
+      <w:r>
+        <w:t xml:space="preserve"> = "Sabrina Carpenter";</w:t>
       </w:r>
     </w:p>
+    <w:p/>
+    <w:p/>
     <w:p>
       <w:pPr>
-        <w:rPr>
-          <w:lang w:val="en-GB"/>
-        </w:rPr>
+        <w:pStyle w:val="berschrift3"/>
       </w:pPr>
+      <w:r>
+        <w:t>.</w:t>
+      </w:r>
+      <w:proofErr w:type="spellStart"/>
+      <w:r>
+        <w:t>gitignore</w:t>
+      </w:r>
+      <w:proofErr w:type="spellEnd"/>
     </w:p>
-    <w:p>
-      <w:pPr>
-        <w:rPr>
-          <w:lang w:val="en-GB"/>
-        </w:rPr>
-      </w:pPr>
-    </w:p>
-    <w:p>
-      <w:pPr>
-        <w:rPr>
-          <w:lang w:val="en-GB"/>
-        </w:rPr>
-      </w:pPr>
-    </w:p>
-    <w:p>
-      <w:pPr>
-        <w:rPr>
-          <w:lang w:val="en-GB"/>
-        </w:rPr>
-      </w:pPr>
-    </w:p>
-    <w:p>
-      <w:pPr>
-        <w:rPr>
-          <w:lang w:val="en-GB"/>
-        </w:rPr>
-      </w:pPr>
-    </w:p>
-    <w:p>
-      <w:pPr>
-        <w:rPr>
-          <w:lang w:val="en-GB"/>
-        </w:rPr>
-      </w:pPr>
-    </w:p>
-    <w:p>
-      <w:pPr>
-        <w:rPr>
-          <w:lang w:val="en-GB"/>
-        </w:rPr>
-      </w:pPr>
-    </w:p>
-    <w:p>
-      <w:pPr>
-        <w:rPr>
-          <w:lang w:val="en-GB"/>
-        </w:rPr>
-      </w:pPr>
-    </w:p>
-    <w:p>
-      <w:pPr>
-        <w:rPr>
-          <w:lang w:val="en-GB"/>
-        </w:rPr>
-      </w:pPr>
-    </w:p>
+    <w:tbl>
+      <w:tblPr>
+        <w:tblW w:w="0" w:type="auto"/>
+        <w:tblCellSpacing w:w="15" w:type="dxa"/>
+        <w:tblCellMar>
+          <w:top w:w="15" w:type="dxa"/>
+          <w:left w:w="15" w:type="dxa"/>
+          <w:bottom w:w="15" w:type="dxa"/>
+          <w:right w:w="15" w:type="dxa"/>
+        </w:tblCellMar>
+        <w:tblLook w:val="04A0" w:firstRow="1" w:lastRow="0" w:firstColumn="1" w:lastColumn="0" w:noHBand="0" w:noVBand="1"/>
+      </w:tblPr>
+      <w:tblGrid>
+        <w:gridCol w:w="2196"/>
+        <w:gridCol w:w="2149"/>
+        <w:gridCol w:w="1889"/>
+        <w:gridCol w:w="2822"/>
+      </w:tblGrid>
+      <w:tr>
+        <w:trPr>
+          <w:tblHeader/>
+          <w:tblCellSpacing w:w="15" w:type="dxa"/>
+        </w:trPr>
+        <w:tc>
+          <w:tcPr>
+            <w:tcW w:w="0" w:type="auto"/>
+            <w:tcBorders>
+              <w:top w:val="single" w:sz="6" w:space="0" w:color="C4C7C5"/>
+              <w:left w:val="single" w:sz="6" w:space="0" w:color="C4C7C5"/>
+              <w:bottom w:val="single" w:sz="6" w:space="0" w:color="C4C7C5"/>
+              <w:right w:val="single" w:sz="6" w:space="0" w:color="C4C7C5"/>
+            </w:tcBorders>
+            <w:tcMar>
+              <w:top w:w="120" w:type="dxa"/>
+              <w:left w:w="180" w:type="dxa"/>
+              <w:bottom w:w="120" w:type="dxa"/>
+              <w:right w:w="180" w:type="dxa"/>
+            </w:tcMar>
+            <w:vAlign w:val="center"/>
+            <w:hideMark/>
+          </w:tcPr>
+          <w:p>
+            <w:r>
+              <w:rPr>
+                <w:b/>
+                <w:bCs/>
+              </w:rPr>
+              <w:t>Symbol</w:t>
+            </w:r>
+          </w:p>
+        </w:tc>
+        <w:tc>
+          <w:tcPr>
+            <w:tcW w:w="0" w:type="auto"/>
+            <w:tcBorders>
+              <w:top w:val="single" w:sz="6" w:space="0" w:color="C4C7C5"/>
+              <w:left w:val="single" w:sz="6" w:space="0" w:color="C4C7C5"/>
+              <w:bottom w:val="single" w:sz="6" w:space="0" w:color="C4C7C5"/>
+              <w:right w:val="single" w:sz="6" w:space="0" w:color="C4C7C5"/>
+            </w:tcBorders>
+            <w:tcMar>
+              <w:top w:w="120" w:type="dxa"/>
+              <w:left w:w="180" w:type="dxa"/>
+              <w:bottom w:w="120" w:type="dxa"/>
+              <w:right w:w="180" w:type="dxa"/>
+            </w:tcMar>
+            <w:vAlign w:val="center"/>
+            <w:hideMark/>
+          </w:tcPr>
+          <w:p>
+            <w:r>
+              <w:rPr>
+                <w:b/>
+                <w:bCs/>
+              </w:rPr>
+              <w:t>Bedeutung</w:t>
+            </w:r>
+          </w:p>
+        </w:tc>
+        <w:tc>
+          <w:tcPr>
+            <w:tcW w:w="0" w:type="auto"/>
+            <w:tcBorders>
+              <w:top w:val="single" w:sz="6" w:space="0" w:color="C4C7C5"/>
+              <w:left w:val="single" w:sz="6" w:space="0" w:color="C4C7C5"/>
+              <w:bottom w:val="single" w:sz="6" w:space="0" w:color="C4C7C5"/>
+              <w:right w:val="single" w:sz="6" w:space="0" w:color="C4C7C5"/>
+            </w:tcBorders>
+            <w:tcMar>
+              <w:top w:w="120" w:type="dxa"/>
+              <w:left w:w="180" w:type="dxa"/>
+              <w:bottom w:w="120" w:type="dxa"/>
+              <w:right w:w="180" w:type="dxa"/>
+            </w:tcMar>
+            <w:vAlign w:val="center"/>
+            <w:hideMark/>
+          </w:tcPr>
+          <w:p>
+            <w:r>
+              <w:rPr>
+                <w:b/>
+                <w:bCs/>
+              </w:rPr>
+              <w:t>Beispiel</w:t>
+            </w:r>
+          </w:p>
+        </w:tc>
+        <w:tc>
+          <w:tcPr>
+            <w:tcW w:w="0" w:type="auto"/>
+            <w:tcBorders>
+              <w:top w:val="single" w:sz="6" w:space="0" w:color="C4C7C5"/>
+              <w:left w:val="single" w:sz="6" w:space="0" w:color="C4C7C5"/>
+              <w:bottom w:val="single" w:sz="6" w:space="0" w:color="C4C7C5"/>
+              <w:right w:val="single" w:sz="6" w:space="0" w:color="C4C7C5"/>
+            </w:tcBorders>
+            <w:tcMar>
+              <w:top w:w="120" w:type="dxa"/>
+              <w:left w:w="180" w:type="dxa"/>
+              <w:bottom w:w="120" w:type="dxa"/>
+              <w:right w:w="180" w:type="dxa"/>
+            </w:tcMar>
+            <w:vAlign w:val="center"/>
+            <w:hideMark/>
+          </w:tcPr>
+          <w:p>
+            <w:r>
+              <w:rPr>
+                <w:b/>
+                <w:bCs/>
+              </w:rPr>
+              <w:t>Was passiert?</w:t>
+            </w:r>
+          </w:p>
+        </w:tc>
+      </w:tr>
+      <w:tr>
+        <w:trPr>
+          <w:tblCellSpacing w:w="15" w:type="dxa"/>
+        </w:trPr>
+        <w:tc>
+          <w:tcPr>
+            <w:tcW w:w="0" w:type="auto"/>
+            <w:tcBorders>
+              <w:top w:val="single" w:sz="6" w:space="0" w:color="C4C7C5"/>
+              <w:left w:val="single" w:sz="6" w:space="0" w:color="C4C7C5"/>
+              <w:bottom w:val="single" w:sz="6" w:space="0" w:color="C4C7C5"/>
+              <w:right w:val="single" w:sz="6" w:space="0" w:color="C4C7C5"/>
+            </w:tcBorders>
+            <w:tcMar>
+              <w:top w:w="120" w:type="dxa"/>
+              <w:left w:w="180" w:type="dxa"/>
+              <w:bottom w:w="120" w:type="dxa"/>
+              <w:right w:w="180" w:type="dxa"/>
+            </w:tcMar>
+            <w:vAlign w:val="center"/>
+            <w:hideMark/>
+          </w:tcPr>
+          <w:p>
+            <w:r>
+              <w:rPr>
+                <w:b/>
+                <w:bCs/>
+              </w:rPr>
+              <w:t>/</w:t>
+            </w:r>
+            <w:r>
+              <w:t xml:space="preserve"> (Schrägstrich)</w:t>
+            </w:r>
+          </w:p>
+        </w:tc>
+        <w:tc>
+          <w:tcPr>
+            <w:tcW w:w="0" w:type="auto"/>
+            <w:tcBorders>
+              <w:top w:val="single" w:sz="6" w:space="0" w:color="C4C7C5"/>
+              <w:left w:val="single" w:sz="6" w:space="0" w:color="C4C7C5"/>
+              <w:bottom w:val="single" w:sz="6" w:space="0" w:color="C4C7C5"/>
+              <w:right w:val="single" w:sz="6" w:space="0" w:color="C4C7C5"/>
+            </w:tcBorders>
+            <w:tcMar>
+              <w:top w:w="120" w:type="dxa"/>
+              <w:left w:w="180" w:type="dxa"/>
+              <w:bottom w:w="120" w:type="dxa"/>
+              <w:right w:w="180" w:type="dxa"/>
+            </w:tcMar>
+            <w:vAlign w:val="center"/>
+            <w:hideMark/>
+          </w:tcPr>
+          <w:p>
+            <w:r>
+              <w:t xml:space="preserve">Kennzeichnet einen </w:t>
+            </w:r>
+            <w:r>
+              <w:rPr>
+                <w:b/>
+                <w:bCs/>
+              </w:rPr>
+              <w:t>Ordner</w:t>
+            </w:r>
+          </w:p>
+        </w:tc>
+        <w:tc>
+          <w:tcPr>
+            <w:tcW w:w="0" w:type="auto"/>
+            <w:tcBorders>
+              <w:top w:val="single" w:sz="6" w:space="0" w:color="C4C7C5"/>
+              <w:left w:val="single" w:sz="6" w:space="0" w:color="C4C7C5"/>
+              <w:bottom w:val="single" w:sz="6" w:space="0" w:color="C4C7C5"/>
+              <w:right w:val="single" w:sz="6" w:space="0" w:color="C4C7C5"/>
+            </w:tcBorders>
+            <w:tcMar>
+              <w:top w:w="120" w:type="dxa"/>
+              <w:left w:w="180" w:type="dxa"/>
+              <w:bottom w:w="120" w:type="dxa"/>
+              <w:right w:w="180" w:type="dxa"/>
+            </w:tcMar>
+            <w:vAlign w:val="center"/>
+            <w:hideMark/>
+          </w:tcPr>
+          <w:p>
+            <w:proofErr w:type="spellStart"/>
+            <w:r>
+              <w:t>build</w:t>
+            </w:r>
+            <w:proofErr w:type="spellEnd"/>
+            <w:r>
+              <w:t>/</w:t>
+            </w:r>
+          </w:p>
+        </w:tc>
+        <w:tc>
+          <w:tcPr>
+            <w:tcW w:w="0" w:type="auto"/>
+            <w:tcBorders>
+              <w:top w:val="single" w:sz="6" w:space="0" w:color="C4C7C5"/>
+              <w:left w:val="single" w:sz="6" w:space="0" w:color="C4C7C5"/>
+              <w:bottom w:val="single" w:sz="6" w:space="0" w:color="C4C7C5"/>
+              <w:right w:val="single" w:sz="6" w:space="0" w:color="C4C7C5"/>
+            </w:tcBorders>
+            <w:tcMar>
+              <w:top w:w="120" w:type="dxa"/>
+              <w:left w:w="180" w:type="dxa"/>
+              <w:bottom w:w="120" w:type="dxa"/>
+              <w:right w:w="180" w:type="dxa"/>
+            </w:tcMar>
+            <w:vAlign w:val="center"/>
+            <w:hideMark/>
+          </w:tcPr>
+          <w:p>
+            <w:r>
+              <w:t xml:space="preserve">Der gesamte Ordner </w:t>
+            </w:r>
+            <w:proofErr w:type="spellStart"/>
+            <w:r>
+              <w:t>build</w:t>
+            </w:r>
+            <w:proofErr w:type="spellEnd"/>
+            <w:r>
+              <w:t xml:space="preserve"> wird ignoriert.</w:t>
+            </w:r>
+          </w:p>
+        </w:tc>
+      </w:tr>
+      <w:tr>
+        <w:trPr>
+          <w:tblCellSpacing w:w="15" w:type="dxa"/>
+        </w:trPr>
+        <w:tc>
+          <w:tcPr>
+            <w:tcW w:w="0" w:type="auto"/>
+            <w:tcBorders>
+              <w:top w:val="single" w:sz="6" w:space="0" w:color="C4C7C5"/>
+              <w:left w:val="single" w:sz="6" w:space="0" w:color="C4C7C5"/>
+              <w:bottom w:val="single" w:sz="6" w:space="0" w:color="C4C7C5"/>
+              <w:right w:val="single" w:sz="6" w:space="0" w:color="C4C7C5"/>
+            </w:tcBorders>
+            <w:tcMar>
+              <w:top w:w="120" w:type="dxa"/>
+              <w:left w:w="180" w:type="dxa"/>
+              <w:bottom w:w="120" w:type="dxa"/>
+              <w:right w:w="180" w:type="dxa"/>
+            </w:tcMar>
+            <w:vAlign w:val="center"/>
+            <w:hideMark/>
+          </w:tcPr>
+          <w:p>
+            <w:r>
+              <w:rPr>
+                <w:b/>
+                <w:bCs/>
+              </w:rPr>
+              <w:t>*</w:t>
+            </w:r>
+            <w:r>
+              <w:t xml:space="preserve"> (Sternchen)</w:t>
+            </w:r>
+          </w:p>
+        </w:tc>
+        <w:tc>
+          <w:tcPr>
+            <w:tcW w:w="0" w:type="auto"/>
+            <w:tcBorders>
+              <w:top w:val="single" w:sz="6" w:space="0" w:color="C4C7C5"/>
+              <w:left w:val="single" w:sz="6" w:space="0" w:color="C4C7C5"/>
+              <w:bottom w:val="single" w:sz="6" w:space="0" w:color="C4C7C5"/>
+              <w:right w:val="single" w:sz="6" w:space="0" w:color="C4C7C5"/>
+            </w:tcBorders>
+            <w:tcMar>
+              <w:top w:w="120" w:type="dxa"/>
+              <w:left w:w="180" w:type="dxa"/>
+              <w:bottom w:w="120" w:type="dxa"/>
+              <w:right w:w="180" w:type="dxa"/>
+            </w:tcMar>
+            <w:vAlign w:val="center"/>
+            <w:hideMark/>
+          </w:tcPr>
+          <w:p>
+            <w:r>
+              <w:t xml:space="preserve">Platzhalter für </w:t>
+            </w:r>
+            <w:r>
+              <w:rPr>
+                <w:b/>
+                <w:bCs/>
+              </w:rPr>
+              <w:t>beliebige Zeichen</w:t>
+            </w:r>
+          </w:p>
+        </w:tc>
+        <w:tc>
+          <w:tcPr>
+            <w:tcW w:w="0" w:type="auto"/>
+            <w:tcBorders>
+              <w:top w:val="single" w:sz="6" w:space="0" w:color="C4C7C5"/>
+              <w:left w:val="single" w:sz="6" w:space="0" w:color="C4C7C5"/>
+              <w:bottom w:val="single" w:sz="6" w:space="0" w:color="C4C7C5"/>
+              <w:right w:val="single" w:sz="6" w:space="0" w:color="C4C7C5"/>
+            </w:tcBorders>
+            <w:tcMar>
+              <w:top w:w="120" w:type="dxa"/>
+              <w:left w:w="180" w:type="dxa"/>
+              <w:bottom w:w="120" w:type="dxa"/>
+              <w:right w:w="180" w:type="dxa"/>
+            </w:tcMar>
+            <w:vAlign w:val="center"/>
+            <w:hideMark/>
+          </w:tcPr>
+          <w:p>
+            <w:r>
+              <w:t>*.log</w:t>
+            </w:r>
+          </w:p>
+        </w:tc>
+        <w:tc>
+          <w:tcPr>
+            <w:tcW w:w="0" w:type="auto"/>
+            <w:tcBorders>
+              <w:top w:val="single" w:sz="6" w:space="0" w:color="C4C7C5"/>
+              <w:left w:val="single" w:sz="6" w:space="0" w:color="C4C7C5"/>
+              <w:bottom w:val="single" w:sz="6" w:space="0" w:color="C4C7C5"/>
+              <w:right w:val="single" w:sz="6" w:space="0" w:color="C4C7C5"/>
+            </w:tcBorders>
+            <w:tcMar>
+              <w:top w:w="120" w:type="dxa"/>
+              <w:left w:w="180" w:type="dxa"/>
+              <w:bottom w:w="120" w:type="dxa"/>
+              <w:right w:w="180" w:type="dxa"/>
+            </w:tcMar>
+            <w:vAlign w:val="center"/>
+            <w:hideMark/>
+          </w:tcPr>
+          <w:p>
+            <w:r>
+              <w:t xml:space="preserve">Ignoriert </w:t>
+            </w:r>
+            <w:r>
+              <w:rPr>
+                <w:i/>
+                <w:iCs/>
+              </w:rPr>
+              <w:t>alle</w:t>
+            </w:r>
+            <w:r>
+              <w:t xml:space="preserve"> Dateien, die auf .log enden (z. B. error.log, app.log).</w:t>
+            </w:r>
+          </w:p>
+        </w:tc>
+      </w:tr>
+      <w:tr>
+        <w:trPr>
+          <w:tblCellSpacing w:w="15" w:type="dxa"/>
+        </w:trPr>
+        <w:tc>
+          <w:tcPr>
+            <w:tcW w:w="0" w:type="auto"/>
+            <w:tcBorders>
+              <w:top w:val="single" w:sz="6" w:space="0" w:color="C4C7C5"/>
+              <w:left w:val="single" w:sz="6" w:space="0" w:color="C4C7C5"/>
+              <w:bottom w:val="single" w:sz="6" w:space="0" w:color="C4C7C5"/>
+              <w:right w:val="single" w:sz="6" w:space="0" w:color="C4C7C5"/>
+            </w:tcBorders>
+            <w:tcMar>
+              <w:top w:w="120" w:type="dxa"/>
+              <w:left w:w="180" w:type="dxa"/>
+              <w:bottom w:w="120" w:type="dxa"/>
+              <w:right w:w="180" w:type="dxa"/>
+            </w:tcMar>
+            <w:vAlign w:val="center"/>
+            <w:hideMark/>
+          </w:tcPr>
+          <w:p>
+            <w:r>
+              <w:rPr>
+                <w:b/>
+                <w:bCs/>
+              </w:rPr>
+              <w:t>!</w:t>
+            </w:r>
+            <w:r>
+              <w:t xml:space="preserve"> (Ausrufezeichen)</w:t>
+            </w:r>
+          </w:p>
+        </w:tc>
+        <w:tc>
+          <w:tcPr>
+            <w:tcW w:w="0" w:type="auto"/>
+            <w:tcBorders>
+              <w:top w:val="single" w:sz="6" w:space="0" w:color="C4C7C5"/>
+              <w:left w:val="single" w:sz="6" w:space="0" w:color="C4C7C5"/>
+              <w:bottom w:val="single" w:sz="6" w:space="0" w:color="C4C7C5"/>
+              <w:right w:val="single" w:sz="6" w:space="0" w:color="C4C7C5"/>
+            </w:tcBorders>
+            <w:tcMar>
+              <w:top w:w="120" w:type="dxa"/>
+              <w:left w:w="180" w:type="dxa"/>
+              <w:bottom w:w="120" w:type="dxa"/>
+              <w:right w:w="180" w:type="dxa"/>
+            </w:tcMar>
+            <w:vAlign w:val="center"/>
+            <w:hideMark/>
+          </w:tcPr>
+          <w:p>
+            <w:r>
+              <w:t xml:space="preserve">Eine </w:t>
+            </w:r>
+            <w:r>
+              <w:rPr>
+                <w:b/>
+                <w:bCs/>
+              </w:rPr>
+              <w:t>Ausnahme</w:t>
+            </w:r>
+            <w:r>
+              <w:t xml:space="preserve"> definieren</w:t>
+            </w:r>
+          </w:p>
+        </w:tc>
+        <w:tc>
+          <w:tcPr>
+            <w:tcW w:w="0" w:type="auto"/>
+            <w:tcBorders>
+              <w:top w:val="single" w:sz="6" w:space="0" w:color="C4C7C5"/>
+              <w:left w:val="single" w:sz="6" w:space="0" w:color="C4C7C5"/>
+              <w:bottom w:val="single" w:sz="6" w:space="0" w:color="C4C7C5"/>
+              <w:right w:val="single" w:sz="6" w:space="0" w:color="C4C7C5"/>
+            </w:tcBorders>
+            <w:tcMar>
+              <w:top w:w="120" w:type="dxa"/>
+              <w:left w:w="180" w:type="dxa"/>
+              <w:bottom w:w="120" w:type="dxa"/>
+              <w:right w:w="180" w:type="dxa"/>
+            </w:tcMar>
+            <w:vAlign w:val="center"/>
+            <w:hideMark/>
+          </w:tcPr>
+          <w:p>
+            <w:r>
+              <w:t>!important.log</w:t>
+            </w:r>
+          </w:p>
+        </w:tc>
+        <w:tc>
+          <w:tcPr>
+            <w:tcW w:w="0" w:type="auto"/>
+            <w:tcBorders>
+              <w:top w:val="single" w:sz="6" w:space="0" w:color="C4C7C5"/>
+              <w:left w:val="single" w:sz="6" w:space="0" w:color="C4C7C5"/>
+              <w:bottom w:val="single" w:sz="6" w:space="0" w:color="C4C7C5"/>
+              <w:right w:val="single" w:sz="6" w:space="0" w:color="C4C7C5"/>
+            </w:tcBorders>
+            <w:tcMar>
+              <w:top w:w="120" w:type="dxa"/>
+              <w:left w:w="180" w:type="dxa"/>
+              <w:bottom w:w="120" w:type="dxa"/>
+              <w:right w:w="180" w:type="dxa"/>
+            </w:tcMar>
+            <w:vAlign w:val="center"/>
+            <w:hideMark/>
+          </w:tcPr>
+          <w:p>
+            <w:r>
+              <w:t xml:space="preserve">Diese Datei wird </w:t>
+            </w:r>
+            <w:r>
+              <w:rPr>
+                <w:i/>
+                <w:iCs/>
+              </w:rPr>
+              <w:t>trotzdem</w:t>
+            </w:r>
+            <w:r>
+              <w:t xml:space="preserve"> von </w:t>
+            </w:r>
+            <w:proofErr w:type="spellStart"/>
+            <w:r>
+              <w:t>Git</w:t>
+            </w:r>
+            <w:proofErr w:type="spellEnd"/>
+            <w:r>
+              <w:t xml:space="preserve"> erfasst, obwohl alle anderen .</w:t>
+            </w:r>
+            <w:proofErr w:type="spellStart"/>
+            <w:r>
+              <w:t>log</w:t>
+            </w:r>
+            <w:proofErr w:type="spellEnd"/>
+            <w:r>
+              <w:t>-Dateien ignoriert werden!</w:t>
+            </w:r>
+          </w:p>
+        </w:tc>
+      </w:tr>
+    </w:tbl>
+    <w:p/>
+    <w:p/>
+    <w:p/>
+    <w:p/>
+    <w:p/>
+    <w:p/>
+    <w:p/>
+    <w:p/>
+    <w:p/>
     <w:sectPr>
       <w:pgSz w:w="11906" w:h="16838"/>
       <w:pgMar w:top="1417" w:right="1417" w:bottom="1134" w:left="1417" w:header="708" w:footer="708" w:gutter="0"/>

</xml_diff>